<commit_message>
feat(audit): wire standing-check into pre_build_verification as an advisory stage; total re-derived 58 to 59 and badge and testing doc synced [skip-ci]
</commit_message>
<xml_diff>
--- a/README.docx
+++ b/README.docx
@@ -2680,7 +2680,7 @@
     </w:p>
     <w:bookmarkEnd w:id="44"/>
     <w:bookmarkEnd w:id="45"/>
-    <w:bookmarkStart w:id="189" w:name="documentation"/>
+    <w:bookmarkStart w:id="191" w:name="documentation"/>
     <w:p>
       <w:pPr>
         <w:pStyle w:val="Heading2"/>
@@ -5091,7 +5091,7 @@
       </w:r>
     </w:p>
     <w:bookmarkEnd w:id="130"/>
-    <w:bookmarkStart w:id="140" w:name="quality-security"/>
+    <w:bookmarkStart w:id="142" w:name="quality-security"/>
     <w:p>
       <w:pPr>
         <w:pStyle w:val="Heading3"/>
@@ -5266,14 +5266,29 @@
           <w:rPr>
             <w:rStyle w:val="VerbatimChar"/>
           </w:rPr>
-          <w:t xml:space="preserve">docs/TEST_RESULTS.md</w:t>
-        </w:r>
-      </w:hyperlink>
-      <w:r>
-        <w:t xml:space="preserve"> </w:t>
-      </w:r>
-      <w:r>
-        <w:t xml:space="preserve">— snapshot of last full test run</w:t>
+          <w:t xml:space="preserve">docs/scripts/zero_shortcomings_audit.md</w:t>
+        </w:r>
+      </w:hyperlink>
+      <w:r>
+        <w:t xml:space="preserve"> </w:t>
+      </w:r>
+      <w:r>
+        <w:t xml:space="preserve">— user guide for</w:t>
+      </w:r>
+      <w:r>
+        <w:t xml:space="preserve"> </w:t>
+      </w:r>
+      <w:r>
+        <w:rPr>
+          <w:rStyle w:val="VerbatimChar"/>
+        </w:rPr>
+        <w:t xml:space="preserve">scripts/zero_shortcomings_audit.sh</w:t>
+      </w:r>
+      <w:r>
+        <w:t xml:space="preserve"> </w:t>
+      </w:r>
+      <w:r>
+        <w:t xml:space="preserve">(unified zero-shortcomings enumeration / closure re-verification / standing check)</w:t>
       </w:r>
     </w:p>
     <w:p>
@@ -5289,14 +5304,14 @@
           <w:rPr>
             <w:rStyle w:val="VerbatimChar"/>
           </w:rPr>
-          <w:t xml:space="preserve">docs/TEST_SUITE_GUIDE.md</w:t>
-        </w:r>
-      </w:hyperlink>
-      <w:r>
-        <w:t xml:space="preserve"> </w:t>
-      </w:r>
-      <w:r>
-        <w:t xml:space="preserve">— test suite guide</w:t>
+          <w:t xml:space="preserve">specs/003-zero-shortcomings-audit/</w:t>
+        </w:r>
+      </w:hyperlink>
+      <w:r>
+        <w:t xml:space="preserve"> </w:t>
+      </w:r>
+      <w:r>
+        <w:t xml:space="preserve">— feature spec, plan, research, data model, CLI contract and task list for the zero-shortcomings audit</w:t>
       </w:r>
     </w:p>
     <w:p>
@@ -5312,6 +5327,52 @@
           <w:rPr>
             <w:rStyle w:val="VerbatimChar"/>
           </w:rPr>
+          <w:t xml:space="preserve">docs/TEST_RESULTS.md</w:t>
+        </w:r>
+      </w:hyperlink>
+      <w:r>
+        <w:t xml:space="preserve"> </w:t>
+      </w:r>
+      <w:r>
+        <w:t xml:space="preserve">— snapshot of last full test run</w:t>
+      </w:r>
+    </w:p>
+    <w:p>
+      <w:pPr>
+        <w:pStyle w:val="Compact"/>
+        <w:numPr>
+          <w:ilvl w:val="0"/>
+          <w:numId w:val="1005"/>
+        </w:numPr>
+      </w:pPr>
+      <w:hyperlink r:id="rId140">
+        <w:r>
+          <w:rPr>
+            <w:rStyle w:val="VerbatimChar"/>
+          </w:rPr>
+          <w:t xml:space="preserve">docs/TEST_SUITE_GUIDE.md</w:t>
+        </w:r>
+      </w:hyperlink>
+      <w:r>
+        <w:t xml:space="preserve"> </w:t>
+      </w:r>
+      <w:r>
+        <w:t xml:space="preserve">— test suite guide</w:t>
+      </w:r>
+    </w:p>
+    <w:p>
+      <w:pPr>
+        <w:pStyle w:val="Compact"/>
+        <w:numPr>
+          <w:ilvl w:val="0"/>
+          <w:numId w:val="1005"/>
+        </w:numPr>
+      </w:pPr>
+      <w:hyperlink r:id="rId141">
+        <w:r>
+          <w:rPr>
+            <w:rStyle w:val="VerbatimChar"/>
+          </w:rPr>
           <w:t xml:space="preserve">docs/testing/</w:t>
         </w:r>
       </w:hyperlink>
@@ -5322,8 +5383,8 @@
         <w:t xml:space="preserve">— DDoS resilience + test-type matrix notes</w:t>
       </w:r>
     </w:p>
-    <w:bookmarkEnd w:id="140"/>
-    <w:bookmarkStart w:id="147" w:name="incidents-qa-evidence"/>
+    <w:bookmarkEnd w:id="142"/>
+    <w:bookmarkStart w:id="149" w:name="incidents-qa-evidence"/>
     <w:p>
       <w:pPr>
         <w:pStyle w:val="Heading3"/>
@@ -5383,7 +5444,7 @@
           <w:numId w:val="1006"/>
         </w:numPr>
       </w:pPr>
-      <w:hyperlink r:id="rId141">
+      <w:hyperlink r:id="rId143">
         <w:r>
           <w:rPr>
             <w:rStyle w:val="VerbatimChar"/>
@@ -5438,7 +5499,7 @@
           <w:numId w:val="1006"/>
         </w:numPr>
       </w:pPr>
-      <w:hyperlink r:id="rId142">
+      <w:hyperlink r:id="rId144">
         <w:r>
           <w:rPr>
             <w:rStyle w:val="VerbatimChar"/>
@@ -5452,7 +5513,7 @@
       <w:r>
         <w:t xml:space="preserve">— per-item captured machine evidence (§11.4.5 / §11.4.69 / §11.4.83), one directory per workable item / task run — e.g. </w:t>
       </w:r>
-      <w:hyperlink r:id="rId143">
+      <w:hyperlink r:id="rId145">
         <w:r>
           <w:rPr>
             <w:rStyle w:val="VerbatimChar"/>
@@ -5469,7 +5530,7 @@
           <w:numId w:val="1006"/>
         </w:numPr>
       </w:pPr>
-      <w:hyperlink r:id="rId144">
+      <w:hyperlink r:id="rId146">
         <w:r>
           <w:rPr>
             <w:rStyle w:val="VerbatimChar"/>
@@ -5531,7 +5592,7 @@
           <w:numId w:val="1006"/>
         </w:numPr>
       </w:pPr>
-      <w:hyperlink r:id="rId145">
+      <w:hyperlink r:id="rId147">
         <w:r>
           <w:rPr>
             <w:rStyle w:val="VerbatimChar"/>
@@ -5554,7 +5615,7 @@
           <w:numId w:val="1006"/>
         </w:numPr>
       </w:pPr>
-      <w:hyperlink r:id="rId146">
+      <w:hyperlink r:id="rId148">
         <w:r>
           <w:rPr>
             <w:rStyle w:val="VerbatimChar"/>
@@ -5569,8 +5630,8 @@
         <w:t xml:space="preserve">— the flight-recorder guide for perceived-forced-logout triage</w:t>
       </w:r>
     </w:p>
-    <w:bookmarkEnd w:id="147"/>
-    <w:bookmarkStart w:id="163" w:name="X0eebe225dd881669a8a5767e097c07bffda6d29"/>
+    <w:bookmarkEnd w:id="149"/>
+    <w:bookmarkStart w:id="165" w:name="X0eebe225dd881669a8a5767e097c07bffda6d29"/>
     <w:p>
       <w:pPr>
         <w:pStyle w:val="Heading3"/>
@@ -5607,7 +5668,7 @@
           <w:numId w:val="1007"/>
         </w:numPr>
       </w:pPr>
-      <w:hyperlink r:id="rId148">
+      <w:hyperlink r:id="rId150">
         <w:r>
           <w:rPr>
             <w:rStyle w:val="VerbatimChar"/>
@@ -5630,7 +5691,7 @@
           <w:numId w:val="1007"/>
         </w:numPr>
       </w:pPr>
-      <w:hyperlink r:id="rId149">
+      <w:hyperlink r:id="rId151">
         <w:r>
           <w:rPr>
             <w:rStyle w:val="VerbatimChar"/>
@@ -5653,7 +5714,7 @@
           <w:numId w:val="1007"/>
         </w:numPr>
       </w:pPr>
-      <w:hyperlink r:id="rId150">
+      <w:hyperlink r:id="rId152">
         <w:r>
           <w:rPr>
             <w:rStyle w:val="VerbatimChar"/>
@@ -5700,7 +5761,7 @@
           <w:numId w:val="1007"/>
         </w:numPr>
       </w:pPr>
-      <w:hyperlink r:id="rId151">
+      <w:hyperlink r:id="rId153">
         <w:r>
           <w:rPr>
             <w:rStyle w:val="VerbatimChar"/>
@@ -5723,7 +5784,7 @@
           <w:numId w:val="1007"/>
         </w:numPr>
       </w:pPr>
-      <w:hyperlink r:id="rId152">
+      <w:hyperlink r:id="rId154">
         <w:r>
           <w:rPr>
             <w:rStyle w:val="VerbatimChar"/>
@@ -5746,7 +5807,7 @@
           <w:numId w:val="1007"/>
         </w:numPr>
       </w:pPr>
-      <w:hyperlink r:id="rId153">
+      <w:hyperlink r:id="rId155">
         <w:r>
           <w:rPr>
             <w:rStyle w:val="VerbatimChar"/>
@@ -5769,7 +5830,7 @@
           <w:numId w:val="1007"/>
         </w:numPr>
       </w:pPr>
-      <w:hyperlink r:id="rId154">
+      <w:hyperlink r:id="rId156">
         <w:r>
           <w:rPr>
             <w:rStyle w:val="VerbatimChar"/>
@@ -5792,7 +5853,7 @@
           <w:numId w:val="1007"/>
         </w:numPr>
       </w:pPr>
-      <w:hyperlink r:id="rId155">
+      <w:hyperlink r:id="rId157">
         <w:r>
           <w:rPr>
             <w:rStyle w:val="VerbatimChar"/>
@@ -5830,7 +5891,7 @@
           <w:numId w:val="1007"/>
         </w:numPr>
       </w:pPr>
-      <w:hyperlink r:id="rId156">
+      <w:hyperlink r:id="rId158">
         <w:r>
           <w:rPr>
             <w:rStyle w:val="VerbatimChar"/>
@@ -5853,7 +5914,7 @@
           <w:numId w:val="1007"/>
         </w:numPr>
       </w:pPr>
-      <w:hyperlink r:id="rId157">
+      <w:hyperlink r:id="rId159">
         <w:r>
           <w:rPr>
             <w:rStyle w:val="VerbatimChar"/>
@@ -5876,7 +5937,7 @@
           <w:numId w:val="1007"/>
         </w:numPr>
       </w:pPr>
-      <w:hyperlink r:id="rId158">
+      <w:hyperlink r:id="rId160">
         <w:r>
           <w:rPr>
             <w:rStyle w:val="VerbatimChar"/>
@@ -5899,7 +5960,7 @@
           <w:numId w:val="1007"/>
         </w:numPr>
       </w:pPr>
-      <w:hyperlink r:id="rId159">
+      <w:hyperlink r:id="rId161">
         <w:r>
           <w:rPr>
             <w:rStyle w:val="VerbatimChar"/>
@@ -5922,7 +5983,7 @@
           <w:numId w:val="1007"/>
         </w:numPr>
       </w:pPr>
-      <w:hyperlink r:id="rId160">
+      <w:hyperlink r:id="rId162">
         <w:r>
           <w:rPr>
             <w:rStyle w:val="VerbatimChar"/>
@@ -5945,7 +6006,7 @@
           <w:numId w:val="1007"/>
         </w:numPr>
       </w:pPr>
-      <w:hyperlink r:id="rId161">
+      <w:hyperlink r:id="rId163">
         <w:r>
           <w:rPr>
             <w:rStyle w:val="VerbatimChar"/>
@@ -5968,7 +6029,7 @@
           <w:numId w:val="1007"/>
         </w:numPr>
       </w:pPr>
-      <w:hyperlink r:id="rId162">
+      <w:hyperlink r:id="rId164">
         <w:r>
           <w:rPr>
             <w:rStyle w:val="VerbatimChar"/>
@@ -5983,8 +6044,8 @@
         <w:t xml:space="preserve">— superpowers domain summary</w:t>
       </w:r>
     </w:p>
-    <w:bookmarkEnd w:id="163"/>
-    <w:bookmarkStart w:id="166" w:name="manual-qa"/>
+    <w:bookmarkEnd w:id="165"/>
+    <w:bookmarkStart w:id="168" w:name="manual-qa"/>
     <w:p>
       <w:pPr>
         <w:pStyle w:val="Heading3"/>
@@ -6009,7 +6070,7 @@
       <w:r>
         <w:t xml:space="preserve"> </w:t>
       </w:r>
-      <w:hyperlink r:id="rId164">
+      <w:hyperlink r:id="rId166">
         <w:r>
           <w:rPr>
             <w:rStyle w:val="VerbatimChar"/>
@@ -6035,7 +6096,7 @@
           <w:numId w:val="1008"/>
         </w:numPr>
       </w:pPr>
-      <w:hyperlink r:id="rId165">
+      <w:hyperlink r:id="rId167">
         <w:r>
           <w:rPr>
             <w:rStyle w:val="VerbatimChar"/>
@@ -6089,8 +6150,8 @@
         <w:t xml:space="preserve">session range</w:t>
       </w:r>
     </w:p>
-    <w:bookmarkEnd w:id="166"/>
-    <w:bookmarkStart w:id="170" w:name="testing"/>
+    <w:bookmarkEnd w:id="168"/>
+    <w:bookmarkStart w:id="172" w:name="testing"/>
     <w:p>
       <w:pPr>
         <w:pStyle w:val="Heading3"/>
@@ -6107,7 +6168,7 @@
           <w:numId w:val="1009"/>
         </w:numPr>
       </w:pPr>
-      <w:hyperlink r:id="rId167">
+      <w:hyperlink r:id="rId169">
         <w:r>
           <w:rPr>
             <w:rStyle w:val="VerbatimChar"/>
@@ -6130,7 +6191,7 @@
           <w:numId w:val="1009"/>
         </w:numPr>
       </w:pPr>
-      <w:hyperlink r:id="rId168">
+      <w:hyperlink r:id="rId170">
         <w:r>
           <w:rPr>
             <w:rStyle w:val="VerbatimChar"/>
@@ -6153,7 +6214,7 @@
           <w:numId w:val="1009"/>
         </w:numPr>
       </w:pPr>
-      <w:hyperlink r:id="rId169">
+      <w:hyperlink r:id="rId171">
         <w:r>
           <w:rPr>
             <w:rStyle w:val="VerbatimChar"/>
@@ -6183,8 +6244,8 @@
         <w:t xml:space="preserve">tree</w:t>
       </w:r>
     </w:p>
-    <w:bookmarkEnd w:id="170"/>
-    <w:bookmarkStart w:id="179" w:name="development"/>
+    <w:bookmarkEnd w:id="172"/>
+    <w:bookmarkStart w:id="181" w:name="development"/>
     <w:p>
       <w:pPr>
         <w:pStyle w:val="Heading3"/>
@@ -6201,7 +6262,7 @@
           <w:numId w:val="1010"/>
         </w:numPr>
       </w:pPr>
-      <w:hyperlink r:id="rId171">
+      <w:hyperlink r:id="rId173">
         <w:r>
           <w:rPr>
             <w:rStyle w:val="VerbatimChar"/>
@@ -6224,7 +6285,7 @@
           <w:numId w:val="1010"/>
         </w:numPr>
       </w:pPr>
-      <w:hyperlink r:id="rId172">
+      <w:hyperlink r:id="rId174">
         <w:r>
           <w:rPr>
             <w:rStyle w:val="VerbatimChar"/>
@@ -6247,7 +6308,7 @@
           <w:numId w:val="1010"/>
         </w:numPr>
       </w:pPr>
-      <w:hyperlink r:id="rId173">
+      <w:hyperlink r:id="rId175">
         <w:r>
           <w:rPr>
             <w:rStyle w:val="VerbatimChar"/>
@@ -6303,7 +6364,7 @@
           <w:numId w:val="1010"/>
         </w:numPr>
       </w:pPr>
-      <w:hyperlink r:id="rId174">
+      <w:hyperlink r:id="rId176">
         <w:r>
           <w:rPr>
             <w:rStyle w:val="VerbatimChar"/>
@@ -6362,7 +6423,7 @@
       <w:r>
         <w:t xml:space="preserve">— e.g. </w:t>
       </w:r>
-      <w:hyperlink r:id="rId175">
+      <w:hyperlink r:id="rId177">
         <w:r>
           <w:rPr>
             <w:rStyle w:val="VerbatimChar"/>
@@ -6376,7 +6437,7 @@
       <w:r>
         <w:t xml:space="preserve"> </w:t>
       </w:r>
-      <w:hyperlink r:id="rId176">
+      <w:hyperlink r:id="rId178">
         <w:r>
           <w:rPr>
             <w:rStyle w:val="VerbatimChar"/>
@@ -6390,7 +6451,7 @@
       <w:r>
         <w:t xml:space="preserve"> </w:t>
       </w:r>
-      <w:hyperlink r:id="rId177">
+      <w:hyperlink r:id="rId179">
         <w:r>
           <w:rPr>
             <w:rStyle w:val="VerbatimChar"/>
@@ -6404,7 +6465,7 @@
       <w:r>
         <w:t xml:space="preserve"> </w:t>
       </w:r>
-      <w:hyperlink r:id="rId178">
+      <w:hyperlink r:id="rId180">
         <w:r>
           <w:rPr>
             <w:rStyle w:val="VerbatimChar"/>
@@ -6419,8 +6480,8 @@
         <w:t xml:space="preserve">(BOB-228)</w:t>
       </w:r>
     </w:p>
-    <w:bookmarkEnd w:id="179"/>
-    <w:bookmarkStart w:id="184" w:name="courses-self-paced-asciinema"/>
+    <w:bookmarkEnd w:id="181"/>
+    <w:bookmarkStart w:id="186" w:name="courses-self-paced-asciinema"/>
     <w:p>
       <w:pPr>
         <w:pStyle w:val="Heading3"/>
@@ -6437,7 +6498,7 @@
           <w:numId w:val="1011"/>
         </w:numPr>
       </w:pPr>
-      <w:hyperlink r:id="rId180">
+      <w:hyperlink r:id="rId182">
         <w:r>
           <w:rPr>
             <w:rStyle w:val="VerbatimChar"/>
@@ -6460,7 +6521,7 @@
           <w:numId w:val="1011"/>
         </w:numPr>
       </w:pPr>
-      <w:hyperlink r:id="rId181">
+      <w:hyperlink r:id="rId183">
         <w:r>
           <w:rPr>
             <w:rStyle w:val="VerbatimChar"/>
@@ -6483,7 +6544,7 @@
           <w:numId w:val="1011"/>
         </w:numPr>
       </w:pPr>
-      <w:hyperlink r:id="rId182">
+      <w:hyperlink r:id="rId184">
         <w:r>
           <w:rPr>
             <w:rStyle w:val="VerbatimChar"/>
@@ -6506,7 +6567,7 @@
           <w:numId w:val="1011"/>
         </w:numPr>
       </w:pPr>
-      <w:hyperlink r:id="rId183">
+      <w:hyperlink r:id="rId185">
         <w:r>
           <w:rPr>
             <w:rStyle w:val="VerbatimChar"/>
@@ -6521,8 +6582,8 @@
         <w:t xml:space="preserve">— Threat model + scanner bundle</w:t>
       </w:r>
     </w:p>
-    <w:bookmarkEnd w:id="184"/>
-    <w:bookmarkStart w:id="188" w:name="release-ci"/>
+    <w:bookmarkEnd w:id="186"/>
+    <w:bookmarkStart w:id="190" w:name="release-ci"/>
     <w:p>
       <w:pPr>
         <w:pStyle w:val="Heading3"/>
@@ -6539,7 +6600,7 @@
           <w:numId w:val="1012"/>
         </w:numPr>
       </w:pPr>
-      <w:hyperlink r:id="rId185">
+      <w:hyperlink r:id="rId187">
         <w:r>
           <w:rPr>
             <w:rStyle w:val="VerbatimChar"/>
@@ -6556,7 +6617,7 @@
           <w:numId w:val="1012"/>
         </w:numPr>
       </w:pPr>
-      <w:hyperlink r:id="rId186">
+      <w:hyperlink r:id="rId188">
         <w:r>
           <w:rPr>
             <w:rStyle w:val="VerbatimChar"/>
@@ -6579,7 +6640,7 @@
           <w:numId w:val="1012"/>
         </w:numPr>
       </w:pPr>
-      <w:hyperlink r:id="rId187">
+      <w:hyperlink r:id="rId189">
         <w:r>
           <w:rPr>
             <w:rStyle w:val="VerbatimChar"/>
@@ -6601,9 +6662,9 @@
         </w:pict>
       </w:r>
     </w:p>
-    <w:bookmarkEnd w:id="188"/>
-    <w:bookmarkEnd w:id="189"/>
-    <w:bookmarkStart w:id="190" w:name="architecture"/>
+    <w:bookmarkEnd w:id="190"/>
+    <w:bookmarkEnd w:id="191"/>
+    <w:bookmarkStart w:id="192" w:name="architecture"/>
     <w:p>
       <w:pPr>
         <w:pStyle w:val="Heading2"/>
@@ -6817,8 +6878,8 @@
         </w:pict>
       </w:r>
     </w:p>
-    <w:bookmarkEnd w:id="190"/>
-    <w:bookmarkStart w:id="191" w:name="testing-1"/>
+    <w:bookmarkEnd w:id="192"/>
+    <w:bookmarkStart w:id="193" w:name="testing-1"/>
     <w:p>
       <w:pPr>
         <w:pStyle w:val="Heading2"/>
@@ -7259,7 +7320,7 @@
       <w:r>
         <w:t xml:space="preserve"> </w:t>
       </w:r>
-      <w:hyperlink r:id="rId167">
+      <w:hyperlink r:id="rId169">
         <w:r>
           <w:rPr>
             <w:rStyle w:val="VerbatimChar"/>
@@ -7281,8 +7342,8 @@
         </w:pict>
       </w:r>
     </w:p>
-    <w:bookmarkEnd w:id="191"/>
-    <w:bookmarkStart w:id="193" w:name="releases"/>
+    <w:bookmarkEnd w:id="193"/>
+    <w:bookmarkStart w:id="195" w:name="releases"/>
     <w:p>
       <w:pPr>
         <w:pStyle w:val="Heading2"/>
@@ -7301,7 +7362,7 @@
       <w:r>
         <w:t xml:space="preserve"> </w:t>
       </w:r>
-      <w:hyperlink r:id="rId192">
+      <w:hyperlink r:id="rId194">
         <w:r>
           <w:rPr>
             <w:rStyle w:val="VerbatimChar"/>
@@ -7318,7 +7379,7 @@
       <w:r>
         <w:t xml:space="preserve"> </w:t>
       </w:r>
-      <w:hyperlink r:id="rId186">
+      <w:hyperlink r:id="rId188">
         <w:r>
           <w:rPr>
             <w:rStyle w:val="VerbatimChar"/>
@@ -7443,8 +7504,8 @@
         </w:pict>
       </w:r>
     </w:p>
-    <w:bookmarkEnd w:id="193"/>
-    <w:bookmarkStart w:id="194" w:name="contributing"/>
+    <w:bookmarkEnd w:id="195"/>
+    <w:bookmarkStart w:id="196" w:name="contributing"/>
     <w:p>
       <w:pPr>
         <w:pStyle w:val="Heading2"/>
@@ -7463,7 +7524,7 @@
       <w:r>
         <w:t xml:space="preserve"> </w:t>
       </w:r>
-      <w:hyperlink r:id="rId171">
+      <w:hyperlink r:id="rId173">
         <w:r>
           <w:rPr>
             <w:rStyle w:val="VerbatimChar"/>
@@ -7480,7 +7541,7 @@
       <w:r>
         <w:t xml:space="preserve"> </w:t>
       </w:r>
-      <w:hyperlink r:id="rId172">
+      <w:hyperlink r:id="rId174">
         <w:r>
           <w:rPr>
             <w:rStyle w:val="VerbatimChar"/>
@@ -7571,8 +7632,8 @@
         </w:pict>
       </w:r>
     </w:p>
-    <w:bookmarkEnd w:id="194"/>
-    <w:bookmarkStart w:id="196" w:name="license"/>
+    <w:bookmarkEnd w:id="196"/>
+    <w:bookmarkStart w:id="198" w:name="license"/>
     <w:p>
       <w:pPr>
         <w:pStyle w:val="Heading2"/>
@@ -7591,7 +7652,7 @@
       <w:r>
         <w:t xml:space="preserve"> </w:t>
       </w:r>
-      <w:hyperlink r:id="rId195">
+      <w:hyperlink r:id="rId197">
         <w:r>
           <w:rPr>
             <w:rStyle w:val="VerbatimChar"/>
@@ -7603,7 +7664,7 @@
         <w:t xml:space="preserve">.</w:t>
       </w:r>
     </w:p>
-    <w:bookmarkEnd w:id="196"/>
+    <w:bookmarkEnd w:id="198"/>
     <w:sectPr>
       <w:footnotePr>
         <w:numRestart w:val="eachSect"/>

</xml_diff>